<commit_message>
fix(video-film-editing): C05 WA-title dup bug + Round 1 textbook readability polish
Fixed 'W0n / W0n - Title' duplicate header text in 6 C05 notes (source of the TOC/heading bug); rebuilt compiled book + 5 CU volumes so corrected titles propagate. Added section-label/Bab-heading color hierarchy, divider accent rules, footer page numbers, and PDF heading-bookmarks on export. Body text verified byte-identical via text-diff guard - formatting only.

Co-Authored-By: Claude Opus 5 <noreply@anthropic.com>
</commit_message>
<xml_diff>
--- a/video-film-editing/output/05 3.3b Nota Pembelajaran (Kertas Penerangan)/CU C01-C05/3.3b-21 Nota Pembelajaran C05-W01 Import Edit-Decision-List (EDL) (IT-072).docx
+++ b/video-film-editing/output/05 3.3b Nota Pembelajaran (Kertas Penerangan)/CU C01-C05/3.3b-21 Nota Pembelajaran C05-W01 Import Edit-Decision-List (EDL) (IT-072).docx
@@ -737,7 +737,7 @@
                 <w:color w:val="000000"/>
                 <w:sz w:val="20"/>
               </w:rPr>
-              <w:t>W01 / W01 — Import Edit-Decision-List (EDL)</w:t>
+              <w:t>W01 / Import Edit-Decision-List (EDL)</w:t>
             </w:r>
           </w:p>
           <w:p>
@@ -751,7 +751,7 @@
                 <w:color w:val="000000"/>
                 <w:sz w:val="20"/>
               </w:rPr>
-              <w:t>W02 / W02 — Apply visual elements to editing sequences</w:t>
+              <w:t>W02 / Apply visual elements to editing sequences</w:t>
             </w:r>
           </w:p>
           <w:p>
@@ -765,7 +765,7 @@
                 <w:color w:val="000000"/>
                 <w:sz w:val="20"/>
               </w:rPr>
-              <w:t>W03 / W03 — Apply titling to editing sequences</w:t>
+              <w:t>W03 / Apply titling to editing sequences</w:t>
             </w:r>
           </w:p>
           <w:p>
@@ -779,7 +779,7 @@
                 <w:color w:val="000000"/>
                 <w:sz w:val="20"/>
               </w:rPr>
-              <w:t>W04 / W04 — Perform colour correction</w:t>
+              <w:t>W04 / Perform colour correction</w:t>
             </w:r>
           </w:p>
           <w:p>
@@ -793,7 +793,7 @@
                 <w:color w:val="000000"/>
                 <w:sz w:val="20"/>
               </w:rPr>
-              <w:t>W05 / W05 — Apply balanced audio to editing sequence</w:t>
+              <w:t>W05 / Apply balanced audio to editing sequence</w:t>
             </w:r>
           </w:p>
           <w:p>
@@ -807,7 +807,7 @@
                 <w:color w:val="000000"/>
                 <w:sz w:val="20"/>
               </w:rPr>
-              <w:t>W06 / W06 — Perform final online submission</w:t>
+              <w:t>W06 / Perform final online submission</w:t>
             </w:r>
           </w:p>
         </w:tc>

</xml_diff>